<commit_message>
Fill disciplinary notice header/body and fix dark-mode UI feedback
Notice of Disciplinary Action:
- Remove the "Reference No." / "الرقم الاشاري." lines from the header
- Add the bilingual notice body text, top-aligned in the box, and correct the Arabic company name
- Fill the header Date/To (and التاريخ/إلى) with the issue date and recipient, value centered + bold
- Add topAlignCellsStartingWith + appendAfterLabelInParagraph helpers

Personnel-management feedback fixes:
- Readable placeholder colours in light and dark mode
- High-contrast amber unread-notification indicator
- Employee-type dropdowns show readable labels (values unchanged): Resident / Direct Non-Resident / NONE RESIDENT
- "Annuale Leave" (BioApi typo) displayed as "Annual Leave"
- Fix "Employee's Name" placeholder text
- Stop .text-slate-600 from getting a stray background+border box in dark mode (page-header subtitles)

Co-Authored-By: Claude Opus 4.8 <noreply@anthropic.com>
</commit_message>
<xml_diff>
--- a/public/Notice of Disciplinary Action.docx
+++ b/public/Notice of Disciplinary Action.docx
@@ -643,26 +643,6 @@
                 <w:sz w:val="16"/>
                 <w:szCs w:val="16"/>
               </w:rPr>
-              <w:t>Reference No.</w:t>
-            </w:r>
-          </w:p>
-          <w:p>
-            <w:pPr>
-              <w:spacing w:after="117"/>
-              <w:ind w:left="36"/>
-              <w:rPr>
-                <w:rFonts w:ascii="Monstserrat" w:hAnsi="Monstserrat"/>
-                <w:sz w:val="16"/>
-                <w:szCs w:val="16"/>
-              </w:rPr>
-            </w:pPr>
-            <w:r>
-              <w:rPr>
-                <w:rFonts w:ascii="Monstserrat" w:hAnsi="Monstserrat"/>
-                <w:b/>
-                <w:sz w:val="16"/>
-                <w:szCs w:val="16"/>
-              </w:rPr>
               <w:t>To:</w:t>
             </w:r>
           </w:p>
@@ -829,29 +809,6 @@
                 <w:szCs w:val="16"/>
                 <w:rtl/>
               </w:rPr>
-              <w:t xml:space="preserve"> الرقم الاشاري.</w:t>
-            </w:r>
-          </w:p>
-          <w:p>
-            <w:pPr>
-              <w:bidi/>
-              <w:spacing w:after="117"/>
-              <w:ind w:left="-5"/>
-              <w:rPr>
-                <w:rFonts w:ascii="Monstserrat" w:hAnsi="Monstserrat"/>
-                <w:sz w:val="16"/>
-                <w:szCs w:val="16"/>
-              </w:rPr>
-            </w:pPr>
-            <w:r>
-              <w:rPr>
-                <w:rFonts w:ascii="Monstserrat" w:hAnsi="Monstserrat"/>
-                <w:b/>
-                <w:bCs/>
-                <w:sz w:val="16"/>
-                <w:szCs w:val="16"/>
-                <w:rtl/>
-              </w:rPr>
               <w:t xml:space="preserve"> إلى:</w:t>
             </w:r>
           </w:p>
@@ -977,78 +934,193 @@
               <w:right w:val="single" w:sz="4" w:space="0" w:color="000000"/>
             </w:tcBorders>
             <w:shd w:val="clear" w:color="auto" w:fill="FFFFFF"/>
-          </w:tcPr>
-          <w:p>
-            <w:pPr>
-              <w:rPr>
-                <w:rFonts w:ascii="Monstserrat" w:hAnsi="Monstserrat"/>
-                <w:sz w:val="16"/>
-                <w:szCs w:val="16"/>
-              </w:rPr>
-            </w:pPr>
-          </w:p>
-        </w:tc>
-        <w:tc>
-          <w:tcPr>
-            <w:tcW w:w="2076" w:type="dxa"/>
-            <w:tcBorders>
-              <w:top w:val="single" w:sz="4" w:space="0" w:color="000000"/>
-              <w:left w:val="single" w:sz="4" w:space="0" w:color="000000"/>
-              <w:bottom w:val="single" w:sz="4" w:space="0" w:color="000000"/>
-              <w:right w:val="nil"/>
+            <w:vAlign w:val="top"/>
+          </w:tcPr>
+          <w:p>
+            <w:pPr>
+              <w:spacing w:after="120" w:line="240" w:lineRule="auto"/>
+              <w:ind w:left="72" w:right="72"/>
+              <w:jc w:val="both"/>
+              <w:rPr>
+                <w:rFonts w:ascii="Monstserrat" w:hAnsi="Monstserrat"/>
+                <w:sz w:val="18"/>
+                <w:szCs w:val="18"/>
+              </w:rPr>
+            </w:pPr>
+            <w:r>
+              <w:rPr>
+                <w:rFonts w:ascii="Monstserrat" w:hAnsi="Monstserrat"/>
+                <w:sz w:val="18"/>
+                <w:szCs w:val="18"/>
+              </w:rPr>
+              <w:t xml:space="preserve">Following the review and investigation of the matter referred to you, and after considering the available information, supporting documents, and explanation provided, Human Resources has reached a determination based on the established facts and in accordance with the applicable Policies, Procedures, and Code of Conduct of IPH.</w:t>
+            </w:r>
+          </w:p>
+          <w:p>
+            <w:pPr>
+              <w:spacing w:after="120" w:line="240" w:lineRule="auto"/>
+              <w:ind w:left="72" w:right="72"/>
+              <w:jc w:val="both"/>
+              <w:rPr>
+                <w:rFonts w:ascii="Monstserrat" w:hAnsi="Monstserrat"/>
+                <w:sz w:val="18"/>
+                <w:szCs w:val="18"/>
+              </w:rPr>
+            </w:pPr>
+            <w:r>
+              <w:rPr>
+                <w:rFonts w:ascii="Monstserrat" w:hAnsi="Monstserrat"/>
+                <w:sz w:val="18"/>
+                <w:szCs w:val="18"/>
+              </w:rPr>
+              <w:t xml:space="preserve">Accordingly, this Notice of Disciplinary Action is issued to formally inform you of the disciplinary action taken in relation to the matter.</w:t>
+            </w:r>
+          </w:p>
+          <w:p>
+            <w:pPr>
+              <w:spacing w:after="120" w:line="240" w:lineRule="auto"/>
+              <w:ind w:left="72" w:right="72"/>
+              <w:jc w:val="both"/>
+              <w:rPr>
+                <w:rFonts w:ascii="Monstserrat" w:hAnsi="Monstserrat"/>
+                <w:sz w:val="18"/>
+                <w:szCs w:val="18"/>
+              </w:rPr>
+            </w:pPr>
+            <w:r>
+              <w:rPr>
+                <w:rFonts w:ascii="Monstserrat" w:hAnsi="Monstserrat"/>
+                <w:sz w:val="18"/>
+                <w:szCs w:val="18"/>
+              </w:rPr>
+              <w:t xml:space="preserve">You have the right to appeal this decision in accordance with the applicable IPH Policies and Procedures. Any appeal must be submitted in writing to the Personnel Relations Management Department within two (2) days from the date of receipt of this notice, clearly stating the grounds for the appeal and providing any relevant supporting information or documentation.</w:t>
+            </w:r>
+          </w:p>
+          <w:p>
+            <w:pPr>
+              <w:spacing w:after="0" w:line="240" w:lineRule="auto"/>
+              <w:ind w:left="72" w:right="72"/>
+              <w:jc w:val="both"/>
+              <w:rPr>
+                <w:rFonts w:ascii="Monstserrat" w:hAnsi="Monstserrat"/>
+                <w:sz w:val="18"/>
+                <w:szCs w:val="18"/>
+              </w:rPr>
+            </w:pPr>
+            <w:r>
+              <w:rPr>
+                <w:rFonts w:ascii="Monstserrat" w:hAnsi="Monstserrat"/>
+                <w:sz w:val="18"/>
+                <w:szCs w:val="18"/>
+              </w:rPr>
+              <w:t xml:space="preserve">Any appeal submitted after the specified period may not be considered.</w:t>
+            </w:r>
+          </w:p>
+        </w:tc>
+        <w:tc>
+          <w:tcPr>
+            <w:tcW w:w="5664" w:type="dxa"/>
+            <w:gridSpan w:val="3"/>
+            <w:tcBorders>
+              <w:top w:val="single" w:sz="4" w:space="0" w:color="000000"/>
+              <w:left w:val="single" w:sz="4" w:space="0" w:color="000000"/>
+              <w:bottom w:val="single" w:sz="4" w:space="0" w:color="000000"/>
+              <w:right w:val="single" w:sz="4" w:space="0" w:color="000000"/>
             </w:tcBorders>
             <w:shd w:val="clear" w:color="auto" w:fill="FFFFFF"/>
-          </w:tcPr>
-          <w:p>
-            <w:pPr>
-              <w:rPr>
-                <w:rFonts w:ascii="Monstserrat" w:hAnsi="Monstserrat"/>
-                <w:sz w:val="16"/>
-                <w:szCs w:val="16"/>
-              </w:rPr>
-            </w:pPr>
-          </w:p>
-        </w:tc>
-        <w:tc>
-          <w:tcPr>
-            <w:tcW w:w="1505" w:type="dxa"/>
-            <w:tcBorders>
-              <w:top w:val="single" w:sz="4" w:space="0" w:color="000000"/>
-              <w:left w:val="nil"/>
-              <w:bottom w:val="single" w:sz="4" w:space="0" w:color="000000"/>
-              <w:right w:val="nil"/>
-            </w:tcBorders>
-            <w:shd w:val="clear" w:color="auto" w:fill="FFFFFF"/>
-          </w:tcPr>
-          <w:p>
-            <w:pPr>
-              <w:rPr>
-                <w:rFonts w:ascii="Monstserrat" w:hAnsi="Monstserrat"/>
-                <w:sz w:val="16"/>
-                <w:szCs w:val="16"/>
-              </w:rPr>
-            </w:pPr>
-          </w:p>
-        </w:tc>
-        <w:tc>
-          <w:tcPr>
-            <w:tcW w:w="2083" w:type="dxa"/>
-            <w:tcBorders>
-              <w:top w:val="single" w:sz="4" w:space="0" w:color="000000"/>
-              <w:left w:val="nil"/>
-              <w:bottom w:val="single" w:sz="4" w:space="0" w:color="000000"/>
-              <w:right w:val="single" w:sz="4" w:space="0" w:color="000000"/>
-            </w:tcBorders>
-            <w:shd w:val="clear" w:color="auto" w:fill="FFFFFF"/>
-          </w:tcPr>
-          <w:p>
-            <w:pPr>
-              <w:rPr>
-                <w:rFonts w:ascii="Monstserrat" w:hAnsi="Monstserrat"/>
-                <w:sz w:val="16"/>
-                <w:szCs w:val="16"/>
-              </w:rPr>
-            </w:pPr>
+            <w:vAlign w:val="top"/>
+          </w:tcPr>
+          <w:p>
+            <w:pPr>
+              <w:bidi/>
+              <w:spacing w:after="120" w:line="240" w:lineRule="auto"/>
+              <w:ind w:left="72" w:right="72"/>
+              <w:jc w:val="both"/>
+              <w:rPr>
+                <w:rFonts w:ascii="Monstserrat" w:hAnsi="Monstserrat"/>
+                <w:sz w:val="18"/>
+                <w:szCs w:val="18"/>
+                <w:rtl/>
+              </w:rPr>
+            </w:pPr>
+            <w:r>
+              <w:rPr>
+                <w:rFonts w:ascii="Monstserrat" w:hAnsi="Monstserrat"/>
+                <w:sz w:val="18"/>
+                <w:szCs w:val="18"/>
+                <w:rtl/>
+              </w:rPr>
+              <w:t xml:space="preserve">بعد مراجعة والتحقيق في الموضوع المحال إليكم، وبعد النظر في المعلومات المتاحة، والمستندات الداعمة، والإفادة المقدمة، توصلت إدارة الموارد البشرية إلى قرار استنادًا إلى الوقائع المثبتة، وبما يتوافق مع السياسات والإجراءات ومدونة قواعد السلوك المعمول بها في شركة حافظة الاستثمار القابضة.</w:t>
+            </w:r>
+          </w:p>
+          <w:p>
+            <w:pPr>
+              <w:bidi/>
+              <w:spacing w:after="120" w:line="240" w:lineRule="auto"/>
+              <w:ind w:left="72" w:right="72"/>
+              <w:jc w:val="both"/>
+              <w:rPr>
+                <w:rFonts w:ascii="Monstserrat" w:hAnsi="Monstserrat"/>
+                <w:sz w:val="18"/>
+                <w:szCs w:val="18"/>
+                <w:rtl/>
+              </w:rPr>
+            </w:pPr>
+            <w:r>
+              <w:rPr>
+                <w:rFonts w:ascii="Monstserrat" w:hAnsi="Monstserrat"/>
+                <w:sz w:val="18"/>
+                <w:szCs w:val="18"/>
+                <w:rtl/>
+              </w:rPr>
+              <w:t xml:space="preserve">وعليه، يتم إصدار هذا الإشعار بالإجراء التأديبي لإبلاغكم رسميًا بالإجراء التأديبي المتخذ بشأن الموضوع.</w:t>
+            </w:r>
+          </w:p>
+          <w:p>
+            <w:pPr>
+              <w:bidi/>
+              <w:spacing w:after="120" w:line="240" w:lineRule="auto"/>
+              <w:ind w:left="72" w:right="72"/>
+              <w:jc w:val="both"/>
+              <w:rPr>
+                <w:rFonts w:ascii="Monstserrat" w:hAnsi="Monstserrat"/>
+                <w:sz w:val="18"/>
+                <w:szCs w:val="18"/>
+                <w:rtl/>
+              </w:rPr>
+            </w:pPr>
+            <w:r>
+              <w:rPr>
+                <w:rFonts w:ascii="Monstserrat" w:hAnsi="Monstserrat"/>
+                <w:sz w:val="18"/>
+                <w:szCs w:val="18"/>
+                <w:rtl/>
+              </w:rPr>
+              <w:t xml:space="preserve">يحق لكم التظلم من هذا القرار وفقًا للسياسات والإجراءات المعمول بها في شركة حافظة الاستثمار القابضة. ويجب تقديم أي تظلم كتابيًا إلى إدارة علاقات الموظفين خلال يومين (2) من تاريخ استلام هذا الإشعار، مع توضيح أسباب التظلم بشكل واضح وإرفاق أي معلومات أو مستندات داعمة ذات صلة.</w:t>
+            </w:r>
+          </w:p>
+          <w:p>
+            <w:pPr>
+              <w:bidi/>
+              <w:spacing w:after="0" w:line="240" w:lineRule="auto"/>
+              <w:ind w:left="72" w:right="72"/>
+              <w:jc w:val="both"/>
+              <w:rPr>
+                <w:rFonts w:ascii="Monstserrat" w:hAnsi="Monstserrat"/>
+                <w:sz w:val="18"/>
+                <w:szCs w:val="18"/>
+                <w:rtl/>
+              </w:rPr>
+            </w:pPr>
+            <w:r>
+              <w:rPr>
+                <w:rFonts w:ascii="Monstserrat" w:hAnsi="Monstserrat"/>
+                <w:sz w:val="18"/>
+                <w:szCs w:val="18"/>
+                <w:rtl/>
+              </w:rPr>
+              <w:t xml:space="preserve">وقد لا يتم النظر في أي تظلم يتم تقديمه بعد انتهاء المدة المحددة أعلاه.</w:t>
+            </w:r>
           </w:p>
         </w:tc>
       </w:tr>

</xml_diff>